<commit_message>
docs(paper): the paper names the published commit; macros.tex names it and the commit the runs were built at
summarize.py maps the measured commit to the root commit of this history through
PUBLIC_COMMIT (PROVENANCE.md shows the compiled first-party files are identical) and emits
WakeCodeCommit* (published) and WakeMeasuredCommit* (measured). No other generated file
changes. The Word copy is rebuilt (4 pages in Word).
</commit_message>
<xml_diff>
--- a/paper/Tsvetanov-wake-TELECOM2026.docx
+++ b/paper/Tsvetanov-wake-TELECOM2026.docx
@@ -1509,10 +1509,28 @@
         <w:rPr>
           <w:rFonts w:ascii="Courier New" w:hAnsi="Courier New" w:cs="Courier New"/>
         </w:rPr>
+        <w:t>47f14f0</w:t>
+      </w:r>
+      <w:r>
+        <w:t xml:space="preserve">, built at commit </w:t>
+      </w:r>
+      <w:r>
+        <w:rPr>
+          <w:rFonts w:ascii="Courier New" w:hAnsi="Courier New" w:cs="Courier New"/>
+        </w:rPr>
         <w:t>0af1ac4</w:t>
       </w:r>
       <w:r>
-        <w:t xml:space="preserve"> on both systems, built with clang 22.1.8 and clang-cl 22.1.0. The timer slack is 1 ns, except in the </w:t>
+        <w:t>, which the published history does not contain, from identical first-party files (</w:t>
+      </w:r>
+      <w:r>
+        <w:rPr>
+          <w:rFonts w:ascii="Courier New" w:hAnsi="Courier New" w:cs="Courier New"/>
+        </w:rPr>
+        <w:t>PROVENANCE.md</w:t>
+      </w:r>
+      <w:r>
+        <w:t xml:space="preserve">), with clang 22.1.8 and clang-cl 22.1.0. The timer slack is 1 ns, except in the </w:t>
       </w:r>
       <w:r>
         <w:rPr>

</xml_diff>

<commit_message>
docs: the paper rests on public material only
The paper no longer cites the private commit the runs were built at. It names
commit 47f14f0 and rests the identity of the measured code on public material:
the inputs hashes that each raw run records, the files of 47f14f0, which give
the same hashes, and the sanitizer records now published in
lab/sanitizer-records/ (the five records that gated the runs and the five made
later for 47f14f0). bench/check_records.py on that directory reproduces each
run's gate.json.

The raw runs become the assets of release data-2026-10, each with its sha256.
hypotheses.md gains a dated revision-log entry that quotes the first version,
which the paper's note on the dropped 100 us bound rests on. "Pre-registered"
becomes "pre-specified". READMEs, PROVENANCE.md and NOTICE say what is public,
what stays private and why. No number changes; results/rework/ regenerates
byte for byte from the release tarballs. Word and LaTeX: 4 pages.
</commit_message>
<xml_diff>
--- a/paper/Tsvetanov-wake-TELECOM2026.docx
+++ b/paper/Tsvetanov-wake-TELECOM2026.docx
@@ -175,7 +175,7 @@
         <w:t>bounded-wait wake defect</w:t>
       </w:r>
       <w:r>
-        <w:t>. We describe how it arises with the kernel interfaces used by portable C++ servers (Section II), model its delay (Section III), and propose a portable test that needs no access to the internals of the loop (Section IV). We measure both on a minimal event loop written for this study, with epoll, io_uring and IOCP backends and a compile-time switch that seeds the defect in each (Sections V and VI). Everything needed to repeat the study (the loop, its tests, the probe, the run scripts, the generated tables and the hypotheses with their revision log) is available at https:/​/​github.com/​Alex-Tsvetanov/​paper-wake-defect.</w:t>
+        <w:t>. We describe how it arises with the kernel interfaces used by portable C++ servers (Section II), model its delay (Section III), and propose a portable test that needs no access to the internals of the loop (Section IV). We measure both on a minimal event loop written for this study, with epoll, io_uring and IOCP backends and a compile-time switch that seeds the defect in each (Sections V and VI). The repository of the study, with the loop, its tests, the probe, the run scripts, the raw runs, the sanitizer records and the hypotheses with their revision log, is available at https:/​/​github.com/​Alex-Tsvetanov/​paper-wake-defect.</w:t>
       </w:r>
     </w:p>
     <w:p>
@@ -1002,7 +1002,7 @@
         <w:t>Hypotheses.</w:t>
       </w:r>
       <w:r>
-        <w:t xml:space="preserve"> The hypotheses and their acceptance criteria were fixed before any publication run (Table I) and are kept in the repository with a dated revision log. Revisions after smoke runs, before any publication run, renumbered and reworded them as H1 to H4 (a prediction from the measured phase and </w:t>
+        <w:t xml:space="preserve"> The hypotheses and their acceptance criteria were fixed before any publication run (Table I), as their dated revision log in the repository records. Revisions after smoke runs, before any publication run, renumbered and reworded them as H1 to H4 (a prediction from the measured phase and </w:t>
       </w:r>
       <w:r>
         <w:rPr>
@@ -1086,7 +1086,7 @@
         <w:keepNext/>
       </w:pPr>
       <w:r>
-        <w:t>Pre-registered hypotheses and their outcomes</w:t>
+        <w:t>Pre-specified hypotheses and their outcomes</w:t>
       </w:r>
     </w:p>
     <w:tbl>
@@ -1503,7 +1503,7 @@
         <w:t>μ</w:t>
       </w:r>
       <w:r>
-        <w:t xml:space="preserve">s. Windows runs use a Ryzen 5 3600 desktop with Windows 11 and the power plan recorded with the run, whose minimum processor state on mains power is set to its highest value (checked on the host after the runs). The runs measure the loop at repository commit </w:t>
+        <w:t xml:space="preserve">s. Windows runs use a Ryzen 5 3600 desktop with Windows 11 and the power plan recorded with the run, whose minimum processor state on mains power is set to its highest value (checked on the host after the runs). The runs measure the loop at commit </w:t>
       </w:r>
       <w:r>
         <w:rPr>
@@ -1512,48 +1512,30 @@
         <w:t>47f14f0</w:t>
       </w:r>
       <w:r>
-        <w:t xml:space="preserve">, built at commit </w:t>
+        <w:t xml:space="preserve">, built with clang 22.1.8 and clang-cl 22.1.0; the compiled files’ hashes, recorded with each run, match that commit. The timer slack is 1 ns, except in the </w:t>
+      </w:r>
+      <w:r>
+        <w:rPr>
+          <w:i/>
+        </w:rPr>
+        <w:t>B</w:t>
+      </w:r>
+      <w:r>
+        <w:t xml:space="preserve"> = 1 ms matrix cells repeated at the default of 50 </w:t>
+      </w:r>
+      <w:r>
+        <w:rPr>
+          <w:i/>
+        </w:rPr>
+        <w:t>μ</w:t>
+      </w:r>
+      <w:r>
+        <w:t xml:space="preserve">s. Windows runs use the default timer resolution or 1 ms from </w:t>
       </w:r>
       <w:r>
         <w:rPr>
           <w:rFonts w:ascii="Courier New" w:hAnsi="Courier New" w:cs="Courier New"/>
         </w:rPr>
-        <w:t>0af1ac4</w:t>
-      </w:r>
-      <w:r>
-        <w:t>, which the published history does not contain, from identical first-party files (</w:t>
-      </w:r>
-      <w:r>
-        <w:rPr>
-          <w:rFonts w:ascii="Courier New" w:hAnsi="Courier New" w:cs="Courier New"/>
-        </w:rPr>
-        <w:t>PROVENANCE.md</w:t>
-      </w:r>
-      <w:r>
-        <w:t xml:space="preserve">), with clang 22.1.8 and clang-cl 22.1.0. The timer slack is 1 ns, except in the </w:t>
-      </w:r>
-      <w:r>
-        <w:rPr>
-          <w:i/>
-        </w:rPr>
-        <w:t>B</w:t>
-      </w:r>
-      <w:r>
-        <w:t xml:space="preserve"> = 1 ms matrix cells repeated at the default of 50 </w:t>
-      </w:r>
-      <w:r>
-        <w:rPr>
-          <w:i/>
-        </w:rPr>
-        <w:t>μ</w:t>
-      </w:r>
-      <w:r>
-        <w:t xml:space="preserve">s. Windows runs use the default timer resolution or 1 ms from </w:t>
-      </w:r>
-      <w:r>
-        <w:rPr>
-          <w:rFonts w:ascii="Courier New" w:hAnsi="Courier New" w:cs="Courier New"/>
-        </w:rPr>
         <w:t>timeBeginPeriod</w:t>
       </w:r>
       <w:r>
@@ -1571,7 +1553,7 @@
         <w:t>Validity.</w:t>
       </w:r>
       <w:r>
-        <w:t xml:space="preserve"> A run counts only if every first-party file compiled into its binaries also passed the loop’s tests and a reduced run of every design, with the same configuration and compiler. The sanitizers were AddressSanitizer with UndefinedBehaviorSanitizer, ThreadSanitizer and MemorySanitizer on Linux, and AddressSanitizer with clang-cl on Windows. None of them reported anything. On both systems the hashes of the compiled files are checked against these records before any cell runs. The tests pin the loop’s semantics in both builds and include wake detectors, which pass in every correct build and detect the seeded defect in every defective build.</w:t>
+        <w:t xml:space="preserve"> A run counts only if every first-party file compiled into its binaries also passed the loop’s tests and a reduced run of every design, with the same configuration and compiler. The sanitizers were AddressSanitizer with UndefinedBehaviorSanitizer, ThreadSanitizer and MemorySanitizer on Linux, and AddressSanitizer with clang-cl on Windows. None of them reported anything. On both systems the hashes of the compiled files are checked against these records before any cell runs. These records, and those made later for the published commit, are in the repository. The tests pin the loop’s semantics in both builds and include wake detectors, which pass in every correct build and detect the seeded defect in every defective build.</w:t>
       </w:r>
     </w:p>
     <w:p>
@@ -2160,7 +2142,7 @@
         <w:t>B</w:t>
       </w:r>
       <w:r>
-        <w:t>/5, which a short bound, a sanitizer build or a deep idle state can break. The random-gap design and the resampling of the gap sweep were added after a review of results from the earlier implementation and were not pre-registered.</w:t>
+        <w:t>/5, which a short bound, a sanitizer build or a deep idle state can break. The random-gap design and the resampling of the gap sweep were added after a review of results from the earlier implementation and were not pre-specified.</w:t>
       </w:r>
     </w:p>
     <w:p>

</xml_diff>